<commit_message>
Fix CGPA scale (out of 4.00) and resume typo; tag achievements by role
</commit_message>
<xml_diff>
--- a/public/Shimul_Mahmud_Resume.docx
+++ b/public/Shimul_Mahmud_Resume.docx
@@ -3203,7 +3203,7 @@
           <w:sz w:val="24"/>
           <w:szCs w:val="24"/>
         </w:rPr>
-        <w:t>Technoogy</w:t>
+        <w:t>Technology</w:t>
       </w:r>
       <w:proofErr w:type="spellEnd"/>
       <w:r>
@@ -3443,7 +3443,7 @@
           <w:sz w:val="24"/>
           <w:szCs w:val="24"/>
         </w:rPr>
-        <w:t>Technoogy</w:t>
+        <w:t>Technology</w:t>
       </w:r>
       <w:proofErr w:type="spellEnd"/>
       <w:r>
@@ -3643,7 +3643,7 @@
         <w:rPr>
           <w:bCs w:val="0"/>
         </w:rPr>
-        <w:t>/ 5.00</w:t>
+        <w:t>/ 4.00</w:t>
       </w:r>
     </w:p>
     <w:p>

</xml_diff>